<commit_message>
Remove computer-vision defect detection bullet from technical resume
Co-Authored-By: Claude Opus 5.5 <noreply@anthropic.com>
</commit_message>
<xml_diff>
--- a/public/resumes/brian-asimba-technical-resume.docx
+++ b/public/resumes/brian-asimba-technical-resume.docx
@@ -446,19 +446,6 @@
       </w:pPr>
       <w:r>
         <w:t>Architecting AI models (fully connected neural networks with reverse optimization) into stamping simulation workflows to predict and resolve formability failures, converting failed panels into viable designs; currently in POC, targeting reduced inspection time and elimination of recurring defects.</w:t>
-      </w:r>
-    </w:p>
-    <w:p>
-      <w:pPr>
-        <w:pStyle w:val="ListParagraph"/>
-        <w:numPr>
-          <w:ilvl w:val="0"/>
-          <w:numId w:val="2"/>
-        </w:numPr>
-        <w:spacing w:after="70"/>
-      </w:pPr>
-      <w:r>
-        <w:t>Building a computer-vision defect detection system for automated stamped-surface quality inspection (POC stage), extended into a multi-agent AI architecture spanning design, simulation, and physical validation.</w:t>
       </w:r>
     </w:p>
     <w:p>

</xml_diff>